<commit_message>
update WIS2 Guide INFCOM build
</commit_message>
<xml_diff>
--- a/guide/infcom/guide/wis2-guide-DRAFT-INFCOM-4.docx
+++ b/guide/infcom/guide/wis2-guide-DRAFT-INFCOM-4.docx
@@ -105,7 +105,7 @@
         <w:pStyle w:val="Date"/>
       </w:pPr>
       <w:r>
-        <w:t xml:space="preserve">2026-04-02</w:t>
+        <w:t xml:space="preserve">2026-04-17</w:t>
       </w:r>
     </w:p>
     <w:p>
@@ -7003,7 +7003,7 @@
         </w:numPr>
       </w:pPr>
       <w:r>
-        <w:t xml:space="preserve">A Global Cache may decide not to cache data, for example, if the data are considered too large, or if a WIS2 Node publishes an excessive number of small files. If a Global Cache decides not to cache data, it should behave as though the cache property is set to false and send a message on the</w:t>
+        <w:t xml:space="preserve">A Global Cache may decide not to cache data, for example, if the data are considered too large, or if a WIS2 Node publishes an excessive number of small files. If a Global Cache decides not to cache data, it should behave as though the cache property is set to false and shall send a WME (WIS2 Monitoring Event) message on the</w:t>
       </w:r>
       <w:r>
         <w:t xml:space="preserve"> </w:t>
@@ -7018,7 +7018,7 @@
         <w:t xml:space="preserve"> </w:t>
       </w:r>
       <w:r>
-        <w:t xml:space="preserve">topic hierarchy to inform the originating centre and its GISC. The Global Cache operator should work with the originating WIS2 Node and its GISC to remedy this issue.</w:t>
+        <w:t xml:space="preserve">topic hierarchy to inform other WIS centres about it. The Global Cache operator should work with the originating WIS2 Node and its GISC to remedy this issue.</w:t>
       </w:r>
     </w:p>
     <w:p>

</xml_diff>